<commit_message>
Record chi128 convergence-safety refinement: accepted under unchanged external gates
</commit_message>
<xml_diff>
--- a/research/transition-order/branch128-refinement-report.docx
+++ b/research/transition-order/branch128-refinement-report.docx
@@ -1170,6 +1170,45 @@
           <w:b w:val="0"/>
           <w:i w:val="0"/>
         </w:rPr>
+        <w:t>Finite-chi retention finding</w:t>
+      </w:r>
+    </w:p>
+    <w:p>
+      <w:r>
+        <w:rPr>
+          <w:b w:val="0"/>
+          <w:i w:val="0"/>
+        </w:rPr>
+        <w:t>The separately validated amendment supplies an augmented pair of accepted numerical states at the same p=.30480. Their invariant one-point order differs substantially, so they are not merely the opposite-parity orientations seen at the lower coarse-grid rates. The two trial functionals are both lower for the large-order history among these two constructed states; this is not a global-minimum certificate.</w:t>
+      </w:r>
+    </w:p>
+    <w:p>
+      <w:r>
+        <w:rPr>
+          <w:b w:val="0"/>
+          <w:i w:val="0"/>
+        </w:rPr>
+        <w:t>This is a new rate relative to the original six-point grid and also a different preparation/continuation protocol. The result does not isolate which design change enabled retention. It does not establish two physical phases, a stable metastable state, a nonzero thermodynamic jump, or first order. Finite-chi variational artifacts and stability issues remain possible.</w:t>
+      </w:r>
+    </w:p>
+    <w:p>
+      <w:r>
+        <w:rPr>
+          <w:b w:val="0"/>
+          <w:i w:val="0"/>
+        </w:rPr>
+        <w:t>Read-only AL-state audit: invariant order recomputed from the actual right fixed point is 0.4882324332 / 0.0090272397. This confirms the contrast in the represented trial states rather than only their center tensors; it is not a perturbation-stability test.</w:t>
+      </w:r>
+    </w:p>
+    <w:p>
+      <w:pPr>
+        <w:pStyle w:val="Heading2"/>
+      </w:pPr>
+      <w:r>
+        <w:rPr>
+          <w:b w:val="0"/>
+          <w:i w:val="0"/>
+        </w:rPr>
         <w:t>What is still missing</w:t>
       </w:r>
     </w:p>

</xml_diff>